<commit_message>
Renumber week folders to match course tracker; move Module 3 files to Week 3
</commit_message>
<xml_diff>
--- a/Week 5/ALY3510_MatthewNaughton_Week5_Fall_2026.docx
+++ b/Week 5/ALY3510_MatthewNaughton_Week5_Fall_2026.docx
@@ -14,7 +14,7 @@
           <w:b/>
           <w:i w:val="0"/>
         </w:rPr>
-        <w:t>Deep Learning and Music Recommendation: Modeling My Past, or Helping Me Discover?</w:t>
+        <w:t>AI on the Move: Distributed Intelligence in Smart Grids and Predictive Maintenance</w:t>
       </w:r>
     </w:p>
     <w:p/>
@@ -92,7 +92,7 @@
           <w:b/>
           <w:i w:val="0"/>
         </w:rPr>
-        <w:t>Deep Learning and Music Recommendation: Modeling My Past, or Helping Me Discover?</w:t>
+        <w:t>AI on the Move: Distributed Intelligence in Smart Grids and Predictive Maintenance</w:t>
       </w:r>
     </w:p>
     <w:p>
@@ -117,7 +117,7 @@
           <w:b w:val="0"/>
           <w:i w:val="0"/>
         </w:rPr>
-        <w:t>Music recommendation looks like an ideal job for a neural network. A streaming service knows what I play, skip, save, replay, and group into playlists, and in theory all of that behavior should let a system learn my taste and point me toward music I will like. My experience with Spotify has been more mixed, and the gap between that promise and the result is what I want to examine. Using the course video on neural networks as a starting point, I trace how the basic idea scales into music recommendation, where it works, and where it runs into a harder question: what should the system actually be learning?</w:t>
+        <w:t>Most people picture artificial intelligence as a single powerful program running somewhere in the cloud. Distributed AI takes the “many hands make light work” approach. Rather than relying on one central system to make every decision, it spreads intelligence across many smaller agents that can make decisions locally while still working toward a common goal (AI: The New Era, 2025). As a facilities engineer, I see a lot of parallels with how our operations team, the equipment we depend on, and the systems we use to control and monitor that equipment all work in concert to achieve our objectives. A building is not run by just one brain; it is a collection of systems—chillers, pumps, fire protection, lighting, access control (and the team of human overseers, notwithstanding)—each doing its own job while contributing to the whole. This paper explains distributed AI in plain terms, examines two applications close to my work, and focuses on one challenge, one advantage over centralized AI, and what surprised me most.</w:t>
       </w:r>
     </w:p>
     <w:p>
@@ -129,7 +129,7 @@
           <w:b/>
           <w:i w:val="0"/>
         </w:rPr>
-        <w:t>Key Takeaways From the Video</w:t>
+        <w:t>What Distributed AI Is</w:t>
       </w:r>
     </w:p>
     <w:p>
@@ -142,32 +142,7 @@
           <w:b w:val="0"/>
           <w:i w:val="0"/>
         </w:rPr>
-        <w:t>The video builds the concept around a movie-recommendation neuron. Ratings from three critics enter as inputs, each carrying a weight, and the neuron combines them into a single predicted rating. After I rate the movie myself, the weights adjust—critics who tend to agree with me gain influence, and the ones who do not lose it. Nobody writes a rule saying one critic should count more than another; the system learns that relationship from feedback (CodeAI, 2020). The deeper point is what happens when many of these simple units are stacked into layers, each layer's output feeding the next. That layering is what turns a weighted average into something that can recognize complex patterns, and it is the step from a single neuron to deep learning.</w:t>
-      </w:r>
-    </w:p>
-    <w:p>
-      <w:pPr>
-        <w:jc w:val="center"/>
-      </w:pPr>
-      <w:r>
-        <w:rPr>
-          <w:b/>
-          <w:i w:val="0"/>
-        </w:rPr>
-        <w:t>Two Ways to Learn Taste: Behavior vs. the Music Itself</w:t>
-      </w:r>
-    </w:p>
-    <w:p>
-      <w:pPr>
-        <w:ind w:firstLine="720"/>
-        <w:jc w:val="left"/>
-      </w:pPr>
-      <w:r>
-        <w:rPr>
-          <w:b w:val="0"/>
-          <w:i w:val="0"/>
-        </w:rPr>
-        <w:t>Applied to music, that learning can happen in two very different ways. Spotify leans heavily on collaborative filtering—inferring my taste from my behavior and from patterns across millions of other listeners, on the theory that people who act like me are a good guide to what I will want next. Because its algorithms are proprietary, the exact mechanics can only be inferred, but the general approach is well understood: streams, skips, saves, and playlist choices become the inputs, and the system balances exploiting what it already knows about me against exploring new material (Maheshwari, 2023). Pandora takes the opposite route. Its Music Genome Project has trained musicologists tag each song with hundreds of musical attributes, so recommendations are driven by characteristics of the music itself rather than by what other people happened to click (Pandora, n.d.). One approach models me; the other models the song. The movie-critic example in the video is really a tiny version of the first—weighting other people's opinions—which may be part of why collaborative systems are so good at predicting the familiar and so uneven at surfacing something genuinely new. The overall flow of a behavior-based recommender, including the feedback loop it creates, is shown in Figure 1.</w:t>
+        <w:t>In a centralized system, every piece of data travels to one model, which makes every decision and sends instructions back. Distributed AI replaces that single decision-maker with a network of agents. Each agent holds its own local information and the authority to act on it, and the “intelligence” emerges from how the agents interact rather than from any one of them (IBM, n.d.). Common approaches include multi-agent systems, where agents cooperate or compete toward objectives; federated learning, where models train across many devices without pooling raw data; and edge AI, where computation happens on the device instead of the cloud (AI: The New Era, 2025). In every case, no single system does all the work. The contrast between the two architectures is shown in Figure 1.</w:t>
       </w:r>
     </w:p>
     <w:p>
@@ -191,7 +166,7 @@
           <w:b w:val="0"/>
           <w:i/>
         </w:rPr>
-        <w:t>A Behavior-Based (Collaborative-Filtering) Music Recommender</w:t>
+        <w:t>Centralized AI Versus Distributed AI Architecture</w:t>
       </w:r>
     </w:p>
     <w:p>
@@ -202,7 +177,7 @@
       <w:r>
         <w:drawing>
           <wp:inline xmlns:a="http://schemas.openxmlformats.org/drawingml/2006/main" xmlns:pic="http://schemas.openxmlformats.org/drawingml/2006/picture">
-            <wp:extent cx="5669280" cy="2234481"/>
+            <wp:extent cx="5486400" cy="2939679"/>
             <wp:docPr id="1" name="Picture 1"/>
             <wp:cNvGraphicFramePr>
               <a:graphicFrameLocks noChangeAspect="1"/>
@@ -211,7 +186,7 @@
               <a:graphicData uri="http://schemas.openxmlformats.org/drawingml/2006/picture">
                 <pic:pic>
                   <pic:nvPicPr>
-                    <pic:cNvPr id="0" name="Figure1_Music_Recommendation_Flow.png"/>
+                    <pic:cNvPr id="0" name="Figure1_Centralized_vs_Distributed.png"/>
                     <pic:cNvPicPr/>
                   </pic:nvPicPr>
                   <pic:blipFill>
@@ -223,7 +198,7 @@
                   <pic:spPr>
                     <a:xfrm>
                       <a:off x="0" y="0"/>
-                      <a:ext cx="5669280" cy="2234481"/>
+                      <a:ext cx="5486400" cy="2939679"/>
                     </a:xfrm>
                     <a:prstGeom prst="rect"/>
                   </pic:spPr>
@@ -242,7 +217,95 @@
         <w:t xml:space="preserve">Note. </w:t>
       </w:r>
       <w:r>
-        <w:t>A behavior-based recommender learns from listener activity, predicts recommendations, and treats the listener's response as new training data. That returning arrow is the feedback loop discussed under “Downsides,” which can gradually narrow what the system shows.</w:t>
+        <w:t>In centralized AI, all data routes to one model that makes every decision. In distributed AI, autonomous agents make local decisions and coordinate with one another, so the system continues operating even if individual agents fail. Adapted from concepts in AI: The New Era (2025) and IBM (n.d.).</w:t>
+      </w:r>
+    </w:p>
+    <w:p>
+      <w:pPr>
+        <w:jc w:val="center"/>
+      </w:pPr>
+      <w:r>
+        <w:rPr>
+          <w:b/>
+          <w:i w:val="0"/>
+        </w:rPr>
+        <w:t>Application 1: Smart-Grid and Building Energy Management</w:t>
+      </w:r>
+    </w:p>
+    <w:p>
+      <w:pPr>
+        <w:ind w:firstLine="720"/>
+        <w:jc w:val="left"/>
+      </w:pPr>
+      <w:r>
+        <w:rPr>
+          <w:b w:val="0"/>
+          <w:i w:val="0"/>
+        </w:rPr>
+        <w:t>The electric grid is getting harder to manage as rooftop solar, battery storage, and EVs turn consumers into “prosumers” who both draw and supply power. A single controller cannot model every home and device in real time, especially with the uncertainty renewables introduce. Shojaeighadikolaei et al. (2022) demonstrate a multi-agent deep reinforcement learning framework in which each prosumer runs its own agent that decides when to store, use, or sell energy based on real-time pricing, while the grid operator coordinates the group. Instead of one central controller trying to manage every home and device, each participant makes local decisions based on things like electricity prices and energy demand. The grid operator still provides coordination, but the system does not depend on a single decision-maker. In facilities terms, this is demand response—when the grid is strained, distributed controls shed or shift load automatically instead of waiting for someone to flip switches.</w:t>
+      </w:r>
+    </w:p>
+    <w:p>
+      <w:pPr>
+        <w:jc w:val="center"/>
+      </w:pPr>
+      <w:r>
+        <w:rPr>
+          <w:b/>
+          <w:i w:val="0"/>
+        </w:rPr>
+        <w:t>Application 2: Predictive Maintenance</w:t>
+      </w:r>
+    </w:p>
+    <w:p>
+      <w:pPr>
+        <w:ind w:firstLine="720"/>
+        <w:jc w:val="left"/>
+      </w:pPr>
+      <w:r>
+        <w:rPr>
+          <w:b w:val="0"/>
+          <w:i w:val="0"/>
+        </w:rPr>
+        <w:t>Predictive maintenance hits closest to home. Instead of fixing equipment after it breaks or on a fixed calendar, sensors watch machines for early signs of trouble. Fernández-Miguel et al. (2025) describe predictive-maintenance “ecosystems” built on edge computing, federated learning, and distributed intelligence, where monitoring agents on individual machines detect anomalies locally and organize themselves into a larger network. The problem it solves is unplanned downtime; the agents work together by doing lightweight analysis at the edge and sharing what they learn across sites without exposing raw operational data; and distribution is beneficial because catching a failing bearing or compressor cannot wait for a round trip to the cloud, and no single facility wants to hand over all its data. This is a sharper version of what I do when I troubleshoot a pump or a refrigeration cooler—except the sensing never sleeps and the whole fleet learns from each failure.</w:t>
+      </w:r>
+    </w:p>
+    <w:p>
+      <w:pPr>
+        <w:jc w:val="center"/>
+      </w:pPr>
+      <w:r>
+        <w:rPr>
+          <w:b/>
+          <w:i w:val="0"/>
+        </w:rPr>
+        <w:t>One Challenge and One Advantage</w:t>
+      </w:r>
+    </w:p>
+    <w:p>
+      <w:pPr>
+        <w:ind w:firstLine="720"/>
+        <w:jc w:val="left"/>
+      </w:pPr>
+      <w:r>
+        <w:rPr>
+          <w:b w:val="0"/>
+          <w:i w:val="0"/>
+        </w:rPr>
+        <w:t>The biggest practical challenge I see is interoperability. Distributed AI only works if the agents can actually talk to each other, and in the real world they often cannot. I see this constantly with building systems: a chiller from one vendor, a building management system from another, and an access-control platform from a third rarely share a common language without expensive integration. We have had tremendous difficulty getting our own building management system to behave; it is always misfiring or miscommunicating, and the result is “alarm fatigue”—a Boy Who Cried Wolf scenario where the people, or agents, who are supposed to act on an alarm start dismissing its veracity. The video raises the same point at the AI level: without standardized protocols, agents from different makers struggle to coordinate (AI: The New Era, 2025).</w:t>
+      </w:r>
+    </w:p>
+    <w:p>
+      <w:pPr>
+        <w:ind w:firstLine="720"/>
+        <w:jc w:val="left"/>
+      </w:pPr>
+      <w:r>
+        <w:rPr>
+          <w:b w:val="0"/>
+          <w:i w:val="0"/>
+        </w:rPr>
+        <w:t>The advantage that stands out is fault tolerance. Because no single hub makes every decision, a distributed system degrades gracefully: if one agent or the central link goes down, the rest keep operating, whereas a centralized system can fail all at once (IBM, n.d.). I saw the value of that firsthand. A couple of years ago we suffered a cyberattack that encrypted our building management system, stripping us of all remote control and visibility—the equipment was still physically running, we just could not command or monitor it through our interfaces. In response, we worked in pairs around the clock, staffing the building and touring the mechanical systems by hand, most critically the chillers and cooling towers that keep the data-center racks cool. When the central brain went dark, resilience came from distributing ourselves across the plant; we effectively became the local agents keeping the physical systems running. For critical infrastructure like power and building safety, that kind of resilience matters more than raw efficiency.</w:t>
       </w:r>
     </w:p>
     <w:p>
@@ -267,108 +330,7 @@
           <w:b w:val="0"/>
           <w:i w:val="0"/>
         </w:rPr>
-        <w:t>The part that caught me off guard is that the network never has to know why I like something. It only needs examples and feedback, and it adjusts the weights accordingly. That matters more than it sounds, because musical taste resists explanation. I can say I like the Grateful Dead, The Band, the Rolling Stones, and Van Morrison, but that does not mean I want everything filed under those genres, and even within one band's catalog there are songs I love and songs I skip. Genre and artist similarity do not really describe what I am after.</w:t>
-      </w:r>
-    </w:p>
-    <w:p>
-      <w:pPr>
-        <w:ind w:firstLine="720"/>
-        <w:jc w:val="left"/>
-      </w:pPr>
-      <w:r>
-        <w:rPr>
-          <w:b w:val="0"/>
-          <w:i w:val="0"/>
-        </w:rPr>
-        <w:t>My clearest example came from outside Spotify entirely. I found an Australian group, The Bures Band, through a Reddit thread, liked them enough to build a playlist of their three albums, and let it run into autoplay. The recommendations that followed were the best I can remember getting—mostly artists and songs I did not know but enjoyed, and when a familiar artist appeared it was usually a song I had never heard. Notably, it did not just recycle tracks from playlists I had already curated. I cannot know why autoplay behaved differently, since the algorithm is proprietary, but my suspicion is that one tightly focused playlist gave the system a cleaner signal about what I wanted in that moment than my years of accumulated history ever had. My library represents choices made for different reasons—music for driving, for working, for nostalgia—and averaged together, all of it is legitimately me without describing what I want to discover next. More data did not mean better personalization; a small amount of relevant context did.</w:t>
-      </w:r>
-    </w:p>
-    <w:p>
-      <w:pPr>
-        <w:jc w:val="center"/>
-      </w:pPr>
-      <w:r>
-        <w:rPr>
-          <w:b/>
-          <w:i w:val="0"/>
-        </w:rPr>
-        <w:t>The Most Impactful Use of Neural Networks</w:t>
-      </w:r>
-    </w:p>
-    <w:p>
-      <w:pPr>
-        <w:ind w:firstLine="720"/>
-        <w:jc w:val="left"/>
-      </w:pPr>
-      <w:r>
-        <w:rPr>
-          <w:b w:val="0"/>
-          <w:i w:val="0"/>
-        </w:rPr>
-        <w:t>Music is a low-stakes place to watch this play out, which is part of why it makes a useful example. The most impactful uses of neural networks are probably the ones the video gestures at near the end: detecting disease, predicting floods and wildfires, and supporting conservation (CodeAI, 2020). The common thread with recommendation is pattern recognition at a scale no person could monitor—but the stakes could not be more different. A missed recommendation costs me a good song; a missed early signal of a wildfire or a tumor costs far more. If I had to name the single most impactful use, it would be that class of problems: pointing the same pattern-finding ability at a critical signal and surfacing it early enough for a person to act. Music recommendation is the same machinery aimed at a much gentler target.</w:t>
-      </w:r>
-    </w:p>
-    <w:p>
-      <w:pPr>
-        <w:jc w:val="center"/>
-      </w:pPr>
-      <w:r>
-        <w:rPr>
-          <w:b/>
-          <w:i w:val="0"/>
-        </w:rPr>
-        <w:t>Societal and Business Impact</w:t>
-      </w:r>
-    </w:p>
-    <w:p>
-      <w:pPr>
-        <w:ind w:firstLine="720"/>
-        <w:jc w:val="left"/>
-      </w:pPr>
-      <w:r>
-        <w:rPr>
-          <w:b w:val="0"/>
-          <w:i w:val="0"/>
-        </w:rPr>
-        <w:t>For a streaming business, recommendation is about engagement—keeping listeners on the platform. The more consequential impact is on discovery and on who gets heard. A recommender can connect a listener with an artist they would never have found through radio or their existing social circle, which means these systems increasingly shape which musicians reach an audience at all. My own path to The Bures Band shows both sides: a human community made the introduction, and once Spotify had that starting point, its system carried the discovery further. Spotify now frames discovery, not just prediction, as the hard problem it is working to solve (Spotify Research, 2026)—a meaningful shift, because optimizing for what someone will click is not the same as helping them find something worth hearing.</w:t>
-      </w:r>
-    </w:p>
-    <w:p>
-      <w:pPr>
-        <w:jc w:val="center"/>
-      </w:pPr>
-      <w:r>
-        <w:rPr>
-          <w:b/>
-          <w:i w:val="0"/>
-        </w:rPr>
-        <w:t>Downsides and How to Overcome Them</w:t>
-      </w:r>
-    </w:p>
-    <w:p>
-      <w:pPr>
-        <w:ind w:firstLine="720"/>
-        <w:jc w:val="left"/>
-      </w:pPr>
-      <w:r>
-        <w:rPr>
-          <w:b w:val="0"/>
-          <w:i w:val="0"/>
-        </w:rPr>
-        <w:t>The biggest downside I see is the feedback loop. If I listen to something because the system suggested it, that listen becomes new evidence that I like it, and the system grows more confident in a profile it helped create. Taken far enough, the better a recommender gets at predicting me, the more predictable my listening becomes—similarity crowds out serendipity. There is also the familiar data-quality problem: a model trained on signals that do not reflect what I actually want will produce confident recommendations that still miss.</w:t>
-      </w:r>
-    </w:p>
-    <w:p>
-      <w:pPr>
-        <w:ind w:firstLine="720"/>
-        <w:jc w:val="left"/>
-      </w:pPr>
-      <w:r>
-        <w:rPr>
-          <w:b w:val="0"/>
-          <w:i w:val="0"/>
-        </w:rPr>
-        <w:t>The fix I would want is control over that tradeoff. A listener should be able to tell the system whether a session is about comfort or discovery, and how far outside their established taste to reach. That turns the network into a tool I steer rather than a mirror that keeps showing me back to myself. Spotify's own research points roughly in that direction (Spotify Research, 2026), but I would want it as an explicit control—not something I have to coax out of the system by hand-building a narrow playlist.</w:t>
+        <w:t>What surprised me most was swarm intelligence—the idea, drawn from ant colonies and bird flocks, that complex, coordinated behavior can emerge from simple agents following local rules with no central controller at all (AI: The New Era, 2025). It reframes intelligence as something a group can have: the intelligence does not live in any one agent, but in how they interact. That is also a little unsettling. In a centralized system it is usually clear where a decision came from; in a distributed one, an outcome can emerge from the interactions of dozens or hundreds of agents, which makes the behavior harder to predict and harder to hold accountable when something goes wrong. It is like a game of Telephone, where a small, seemingly innocuous change to the original message can yield a wildly different result by the end—and with no single point to anchor to, how do you course-correct? A better image might be free-form jazz: the music can stray far from any convention until one musician plays something familiar that signals the rest of the group to coalesce around it. Distributed systems may need that kind of beacon to stay coherent.</w:t>
       </w:r>
     </w:p>
     <w:p>
@@ -393,7 +355,7 @@
           <w:b w:val="0"/>
           <w:i w:val="0"/>
         </w:rPr>
-        <w:t>The video makes the mechanics intuitive: weight the inputs, compare the output to reality, adjust, and repeat. Music shows both why that works and where it gets complicated. Learning what I already like is the easy half; the harder and more valuable half is knowing when to reinforce that taste and when to push against it. My best recommendation was not the song the system could most confidently predict—it was the one that sat between familiar and unfamiliar. For music discovery, and arguably for recommendation in general, that second problem is the one worth solving.</w:t>
+        <w:t>Distributed AI pushes decision-making out to where the data is, rather than routing everything through a central authority. In smart grids that keeps supply and demand balanced across millions of independent actors; in predictive maintenance it catches failures early while keeping sensitive data local. The resilience that comes from spreading decisions out is a real advantage over centralized AI, but it only pays off if interoperability and governance keep pace—otherwise coordination breaks down, or no one can say who is accountable when it does. Coming from facilities work, the point that lands hardest is the one the jazz analogy captures: the intelligence that matters in these systems is not in any single agent, but in what emerges between them.</w:t>
       </w:r>
     </w:p>
     <w:p>
@@ -421,19 +383,19 @@
         <w:rPr>
           <w:i w:val="0"/>
         </w:rPr>
-        <w:t xml:space="preserve">CodeAI. (2020, December 1). </w:t>
+        <w:t xml:space="preserve">AI: The New Era. (2025, March 10). </w:t>
       </w:r>
       <w:r>
         <w:rPr>
           <w:i/>
         </w:rPr>
-        <w:t>How neural networks work</w:t>
+        <w:t>Distributed AI systems: The collective intelligence of machines</w:t>
       </w:r>
       <w:r>
         <w:rPr>
           <w:i w:val="0"/>
         </w:rPr>
-        <w:t xml:space="preserve"> [Video]. YouTube. https://www.youtube.com/watch?v=JrXazCEACVo</w:t>
+        <w:t xml:space="preserve"> [Video]. YouTube. https://www.youtube.com/watch?v=cHTvVr1w_7s</w:t>
       </w:r>
     </w:p>
     <w:p>
@@ -444,19 +406,19 @@
         <w:rPr>
           <w:i w:val="0"/>
         </w:rPr>
-        <w:t xml:space="preserve">Maheshwari, C. (2023). </w:t>
+        <w:t xml:space="preserve">Fernández-Miguel, A., Ortíz-Marcos, S., Jiménez-Calzado, M., Fernández del Hoyo, A. P., García-Muiña, F. E., &amp; Settembre-Blundo, D. (2025). Agentic AI in smart manufacturing: Enabling human-centric predictive maintenance ecosystems. </w:t>
       </w:r>
       <w:r>
         <w:rPr>
           <w:i/>
         </w:rPr>
-        <w:t>Music recommendation on Spotify using deep learning</w:t>
+        <w:t>Applied Sciences, 15</w:t>
       </w:r>
       <w:r>
         <w:rPr>
           <w:i w:val="0"/>
         </w:rPr>
-        <w:t>. arXiv. https://doi.org/10.48550/arXiv.2312.10079</w:t>
+        <w:t>(21), 11414. https://doi.org/10.3390/app152111414</w:t>
       </w:r>
     </w:p>
     <w:p>
@@ -467,19 +429,19 @@
         <w:rPr>
           <w:i w:val="0"/>
         </w:rPr>
-        <w:t xml:space="preserve">Pandora. (n.d.). </w:t>
+        <w:t xml:space="preserve">IBM. (n.d.). </w:t>
       </w:r>
       <w:r>
         <w:rPr>
           <w:i/>
         </w:rPr>
-        <w:t>Music Genome Project</w:t>
+        <w:t>What is a multi-agent system?</w:t>
       </w:r>
       <w:r>
         <w:rPr>
           <w:i w:val="0"/>
         </w:rPr>
-        <w:t>. Retrieved September 16, 2026, from https://www.pandora.com/about/mgp</w:t>
+        <w:t xml:space="preserve"> IBM. Retrieved September 16, 2026, from https://www.ibm.com/think/topics/multiagent-system</w:t>
       </w:r>
     </w:p>
     <w:p>
@@ -490,19 +452,19 @@
         <w:rPr>
           <w:i w:val="0"/>
         </w:rPr>
-        <w:t xml:space="preserve">Spotify Research. (2026). </w:t>
+        <w:t xml:space="preserve">Shojaeighadikolaei, A., Ghasemi, A., Jones, K., Dafalla, Y., Bardas, A. G., Ahmadi, R., &amp; Hashemi, M. (2022). </w:t>
       </w:r>
       <w:r>
         <w:rPr>
           <w:i/>
         </w:rPr>
-        <w:t>From models to products: LLMs for recommendation at Spotify scale</w:t>
+        <w:t>Distributed energy management and demand response in smart grids: A multi-agent deep reinforcement learning framework</w:t>
       </w:r>
       <w:r>
         <w:rPr>
           <w:i w:val="0"/>
         </w:rPr>
-        <w:t>. https://research.atspotify.com/2026/8/from-models-to-products-llms-for-recommendation-at-spotify-scale</w:t>
+        <w:t>. arXiv. https://doi.org/10.48550/arXiv.2211.15858</w:t>
       </w:r>
     </w:p>
     <w:sectPr>

</xml_diff>